<commit_message>
Publica presentaciones con citas breves y referencias trazables
</commit_message>
<xml_diff>
--- a/documentos/Indice_Presentaciones_DA1521_2027-1.docx
+++ b/documentos/Indice_Presentaciones_DA1521_2027-1.docx
@@ -946,7 +946,7 @@
           <w:color w:val="1C2B3A"/>
           <w:sz w:val="22"/>
         </w:rPr>
-        <w:t>La colección comprende 10 unidades y 586 láminas de contenido, además de una sección de referencias APA 7 en cada presentación. Las nueve presentaciones históricas proporcionadas para el curso fueron migradas íntegramente; la Unidad 2 se desarrolló conforme al programa oficial para completar la secuencia temática.</w:t>
+        <w:t>La colección comprende 10 unidades y 586 láminas de contenido, además de una sección final de referencias en cada presentación. El conjunto desarrolla la secuencia temática completa del programa oficial y permite acceder directamente a las fuentes institucionales citadas.</w:t>
       </w:r>
     </w:p>
     <w:p>
@@ -1194,7 +1194,7 @@
                 <w:color w:val="003D79"/>
                 <w:sz w:val="20"/>
               </w:rPr>
-              <w:t>Referencias APA 7 y vínculos a fuentes en cada unidad</w:t>
+              <w:t>Citas breves, referencias y vínculos a fuentes en cada unidad</w:t>
             </w:r>
           </w:p>
         </w:tc>
@@ -1450,7 +1450,7 @@
                 <w:color w:val="1C2B3A"/>
                 <w:sz w:val="18"/>
               </w:rPr>
-              <w:t>Archivo histórico</w:t>
+              <w:t>Historia administrativa</w:t>
             </w:r>
             <w:r>
               <w:rPr>
@@ -3277,7 +3277,7 @@
           <w:color w:val="1C2B3A"/>
           <w:sz w:val="22"/>
         </w:rPr>
-        <w:t>Este índice ofrece una puerta de entrada única a la colección de presentaciones. La secuencia puede recorrerse de manera completa o consultarse por unidad; cada presentación conserva sus fuentes APA 7 y los vínculos necesarios para volver a los documentos institucionales que sustentan el contenido.</w:t>
+        <w:t>Este índice ofrece una puerta de entrada única a la colección de presentaciones. La secuencia puede recorrerse de manera completa o consultarse por unidad; cada presentación conserva sus citas, referencias y vínculos necesarios para volver a los documentos institucionales que sustentan el contenido.</w:t>
       </w:r>
       <w:r>
         <w:br w:type="page"/>
@@ -3461,7 +3461,7 @@
                 <w:color w:val="C8D8EE"/>
                 <w:sz w:val="17"/>
               </w:rPr>
-              <w:t>Colección publicada con referencias APA 7 y acceso a fuentes institucionales</w:t>
+              <w:t>Colección publicada con referencias y acceso a fuentes institucionales</w:t>
             </w:r>
           </w:p>
           <w:p>

</xml_diff>